<commit_message>
clean up citation and references
</commit_message>
<xml_diff>
--- a/paper/Strategic Export Diversification NFGU - v2.docx
+++ b/paper/Strategic Export Diversification NFGU - v2.docx
@@ -14176,7 +14176,13 @@
     <w:p/>
     <w:p>
       <w:r>
-        <w:t>This complexity gap has direct implications for productivity growth, the essential driver of sustained income convergence. The McKinsey Global Institute (2025) estimates that achieving the Golden Indonesia 2045 vision requires productivity growth acceleration from the current 2% annually to 4.9% annually. Historical evidence from successful structural transformers - South Korea, Taiwan, and more recently Vietnam - demonstrates that such acceleration is achievable only through sustained diversification into increasingly complex activities that generate learning-by-doing, knowledge spillovers, and capability accumulation.</w:t>
+        <w:t xml:space="preserve">This complexity gap has direct implications for productivity growth, the essential driver of sustained income convergence. McKinsey </w:t>
+      </w:r>
+      <w:r>
+        <w:t>&amp; Company</w:t>
+      </w:r>
+      <w:r>
+        <w:t xml:space="preserve"> (2025) estimates that achieving the Golden Indonesia 2045 vision requires productivity growth acceleration from the current 2% annually to 4.9% annually. Historical evidence from successful structural transformers - South Korea, Taiwan, and more recently Vietnam - demonstrates that such acceleration is achievable only through sustained diversification into increasingly complex activities that generate learning-by-doing, knowledge spillovers, and capability accumulation.</w:t>
       </w:r>
     </w:p>
     <w:p/>
@@ -14701,7 +14707,19 @@
         <w:rPr>
           <w:color w:val="000000"/>
         </w:rPr>
-        <w:t>On the production side, the government has adopted supply management as a complementary policy lever. The 2026 RKAB (mining quota) allocation was set at 270 million wet metric tonnes, down sharply from 375 million in 2025 and below the estimated demand of 345 million tonnes (Crux Investor, 2026). Combined with the shift from flat-rate to progressive royalties announced in March 2025 and the February 2025 mandate requiring foreign exchange earnings from minerals to remain in the domestic banking system for one year, these measures represent a recalibration from volume-driven expansion toward value extraction and resource conservation. The production tightening, coupled with a Chinese sulphuric acid export ban and declining ore grades, contributed to a 37% LME nickel price rally from late December 2025 to April 2026, with the International Nickel Study Group revising its 2026 balance from a 283,000-tonne surplus to a 32,000-tonne deficit.</w:t>
+        <w:t>On the production side, the government has adopted supply management as a complementary policy lever. The 2026 RKAB (mining quota) allocation was set at 270 million wet metric tonnes, down sharply from 375 million in 2025 and below the estimated demand of 345 million tonnes (</w:t>
+      </w:r>
+      <w:r>
+        <w:rPr>
+          <w:color w:val="000000"/>
+        </w:rPr>
+        <w:t>Hughes</w:t>
+      </w:r>
+      <w:r>
+        <w:rPr>
+          <w:color w:val="000000"/>
+        </w:rPr>
+        <w:t>, 2026). Combined with the shift from flat-rate to progressive royalties announced in March 2025 and the February 2025 mandate requiring foreign exchange earnings from minerals to remain in the domestic banking system for one year, these measures represent a recalibration from volume-driven expansion toward value extraction and resource conservation. The production tightening, coupled with a Chinese sulphuric acid export ban and declining ore grades, contributed to a 37% LME nickel price rally from late December 2025 to April 2026, with the International Nickel Study Group revising its 2026 balance from a 283,000-tonne surplus to a 32,000-tonne deficit.</w:t>
       </w:r>
     </w:p>
     <w:p/>
@@ -14856,7 +14874,19 @@
         <w:rPr>
           <w:color w:val="000000"/>
         </w:rPr>
-        <w:t>Environmental and social risks threaten both the political legitimacy and market viability of the transformation agenda. Nickel processing in Sulawesi and Maluku has generated documented environmental damage—toxic tailings, freshwater contamination, and deforestation—alongside labour rights concerns, including 107 fatalities in 104 workplace accidents across nickel smelters between 2019 and 2025 (Public Citizen, 2025). The rapid expansion of captive coal power plants to serve industrial parks has increased the sector's carbon footprint precisely when EU CBAM implementation and battery passport requirements are tightening green credentials for market access. A high-profile environmental disaster or forced labour scandal in the nickel sector could trigger reputational contagion that undermines Indonesia's positioning across the broader diversification portfolio, including the electronics, automotive, and agro-processing sectors that depend on favourable trade access.</w:t>
+        <w:t>Environmental and social risks threaten both the political legitimacy and market viability of the transformation agenda. Nickel processing in Sulawesi and Maluku has generated documented environmental damage—toxic tailings, freshwater contamination, and deforestation—alongside labour rights concerns, including 107 fatalities in 104 workplace accidents across nickel smelters between 2019 and 2025 (</w:t>
+      </w:r>
+      <w:r>
+        <w:rPr>
+          <w:color w:val="000000"/>
+        </w:rPr>
+        <w:t>Camarillo</w:t>
+      </w:r>
+      <w:r>
+        <w:rPr>
+          <w:color w:val="000000"/>
+        </w:rPr>
+        <w:t>, 2025). The rapid expansion of captive coal power plants to serve industrial parks has increased the sector's carbon footprint precisely when EU CBAM implementation and battery passport requirements are tightening green credentials for market access. A high-profile environmental disaster or forced labour scandal in the nickel sector could trigger reputational contagion that undermines Indonesia's positioning across the broader diversification portfolio, including the electronics, automotive, and agro-processing sectors that depend on favourable trade access.</w:t>
       </w:r>
     </w:p>
     <w:p/>
@@ -15061,10 +15091,12 @@
     <w:p>
       <w:pPr>
         <w:pStyle w:val="ListParagraph"/>
+        <w:keepNext w:val="0"/>
         <w:numPr>
           <w:ilvl w:val="0"/>
           <w:numId w:val="27"/>
         </w:numPr>
+        <w:ind w:left="714" w:hanging="357"/>
       </w:pPr>
       <w:r>
         <w:t>Alshamsi, A., Pinheiro, F. L., &amp; Hidalgo, C. A. (2018). Optimal diversification strategies in the networks of related products and of related research areas. Nature Communications, 9(1), 1328. https://doi.org/10.1038/s41467-018-03740-9</w:t>
@@ -15073,10 +15105,12 @@
     <w:p>
       <w:pPr>
         <w:pStyle w:val="ListParagraph"/>
+        <w:keepNext w:val="0"/>
         <w:numPr>
           <w:ilvl w:val="0"/>
           <w:numId w:val="27"/>
         </w:numPr>
+        <w:ind w:left="714" w:hanging="357"/>
       </w:pPr>
       <w:r>
         <w:t>ASEAN Briefing. (2025). Indonesia launches Danantara. ASEAN Briefing, March 10, 2025. https://www.aseanbriefing.com/news/indonesia-officially-launches-new-sovereign-wealth-fund-danantara/</w:t>
@@ -15085,10 +15119,12 @@
     <w:p>
       <w:pPr>
         <w:pStyle w:val="ListParagraph"/>
+        <w:keepNext w:val="0"/>
         <w:numPr>
           <w:ilvl w:val="0"/>
           <w:numId w:val="27"/>
         </w:numPr>
+        <w:ind w:left="714" w:hanging="357"/>
       </w:pPr>
       <w:r>
         <w:t xml:space="preserve">Bahar, D., Hausmann, R., &amp; Hidalgo, C. A. (2014). Neighbors and the evolution of the comparative advantage of nations: Evidence of international knowledge diffusion. Journal of International Economics, 92(1), 111–123. </w:t>
@@ -15111,10 +15147,12 @@
     <w:p>
       <w:pPr>
         <w:pStyle w:val="ListParagraph"/>
+        <w:keepNext w:val="0"/>
         <w:numPr>
           <w:ilvl w:val="0"/>
           <w:numId w:val="27"/>
         </w:numPr>
+        <w:ind w:left="714" w:hanging="357"/>
       </w:pPr>
       <w:r>
         <w:t>Balland, P.-A., Boschma, R., Crespo, J., &amp; Rigby, D. L. (2019). Smart specialization policy in the European Union: Relatedness, knowledge complexity and regional diversification. Regional Studies, 53(9), 1252–1268. https://doi.org/10.1080/00343404.2018.1437900</w:t>
@@ -15123,22 +15161,26 @@
     <w:p>
       <w:pPr>
         <w:pStyle w:val="ListParagraph"/>
+        <w:keepNext w:val="0"/>
         <w:numPr>
           <w:ilvl w:val="0"/>
           <w:numId w:val="27"/>
         </w:numPr>
-      </w:pPr>
-      <w:r>
-        <w:t>CETEX. (2026). How Indonesia’s ban on raw nickel exports reshaped global supply chains. CETEX Policy Insight, March 2026. https://cetex.org/wp-content/uploads/2026/03/Indonesia-Ban-on-Exports-of-Raw-Nickel.pdf</w:t>
+        <w:ind w:left="714" w:hanging="357"/>
+      </w:pPr>
+      <w:r>
+        <w:t>Camarillo, I. (2025). Trade and critical minerals: The deadly cost of nickel mining in Indonesia. Public Citizen's Global Trade Watch, December 2025. https://gtwaction.org/the-deadly-cost-of-nickel-mining-in-indonesia/</w:t>
       </w:r>
     </w:p>
     <w:p>
       <w:pPr>
         <w:pStyle w:val="ListParagraph"/>
+        <w:keepNext w:val="0"/>
         <w:numPr>
           <w:ilvl w:val="0"/>
           <w:numId w:val="27"/>
         </w:numPr>
+        <w:ind w:left="714" w:hanging="357"/>
       </w:pPr>
       <w:r>
         <w:t>Chang, H.-J., &amp; Andreoni, A. (2020). Industrial policy in the 21st century. Development and Change, 51(2), 324–351. https://doi.org/10.1111/dech.12570</w:t>
@@ -15147,10 +15189,12 @@
     <w:p>
       <w:pPr>
         <w:pStyle w:val="ListParagraph"/>
+        <w:keepNext w:val="0"/>
         <w:numPr>
           <w:ilvl w:val="0"/>
           <w:numId w:val="27"/>
         </w:numPr>
+        <w:ind w:left="714" w:hanging="357"/>
       </w:pPr>
       <w:r>
         <w:t>Cristelli, M., Gabrielli, A., Tacchella, A., Caldarelli, G., &amp; Pietronero, L. (2013). Measuring the intangibles: A metrics for the economic complexity of countries and products. PLoS ONE, 8(8), e70726. https://doi.org/10.1371/journal.pone.0070726</w:t>
@@ -15159,122 +15203,144 @@
     <w:p>
       <w:pPr>
         <w:pStyle w:val="ListParagraph"/>
+        <w:keepNext w:val="0"/>
         <w:numPr>
           <w:ilvl w:val="0"/>
           <w:numId w:val="27"/>
         </w:numPr>
-      </w:pPr>
-      <w:r>
-        <w:t>Crux Investor. (2026). Indonesia’s 2026 policy tightening has repriced the nickel cost map. Crux Investor Analysis, May 2026. https://www.cruxinvestor.com/posts/indonesias-2026-policy-tightening-has-repriced-the-nickel-cost-map</w:t>
+        <w:ind w:left="714" w:hanging="357"/>
+      </w:pPr>
+      <w:r>
+        <w:t>Domar, E. D. (1946). Capital expansion, rate of growth, and employment. Econometrica, 14(2), 137–147. https://doi.org/10.2307/1905364</w:t>
       </w:r>
     </w:p>
     <w:p>
       <w:pPr>
         <w:pStyle w:val="ListParagraph"/>
+        <w:keepNext w:val="0"/>
         <w:numPr>
           <w:ilvl w:val="0"/>
           <w:numId w:val="27"/>
         </w:numPr>
       </w:pPr>
       <w:r>
-        <w:t>Domar, E. D. (1946). Capital expansion, rate of growth, and employment. Econometrica, 14(2), 137–147. https://doi.org/10.2307/1905364</w:t>
+        <w:t>European Commission. (2024). Regulation (EU) 2024/1252 of the European Parliament and of the Council establishing a framework for ensuring a secure and sustainable supply of critical raw materials (Critical Raw Materials Act). Official Journal of the European Union, L series, May 23, 2024.</w:t>
       </w:r>
     </w:p>
     <w:p>
       <w:pPr>
         <w:pStyle w:val="ListParagraph"/>
+        <w:keepNext w:val="0"/>
         <w:numPr>
           <w:ilvl w:val="0"/>
           <w:numId w:val="27"/>
         </w:numPr>
       </w:pPr>
       <w:r>
-        <w:t xml:space="preserve">European Commission. (2024). Regulation (EU) 2024/1252 of the European Parliament and of the Council establishing a framework for ensuring a secure and sustainable supply </w:t>
-      </w:r>
-      <w:r>
-        <w:lastRenderedPageBreak/>
-        <w:t>of critical raw materials (Critical Raw Materials Act). Official Journal of the European Union, L series, May 23, 2024.</w:t>
-      </w:r>
+        <w:t xml:space="preserve">Harrod, R. F. (1939). An essay in dynamic theory. The Economic Journal, 49(193), 14–33. </w:t>
+      </w:r>
+      <w:hyperlink r:id="rId18" w:history="1">
+        <w:r>
+          <w:rPr>
+            <w:rStyle w:val="Hyperlink"/>
+          </w:rPr>
+          <w:t>https://doi.org/10.2307/2225181</w:t>
+        </w:r>
+      </w:hyperlink>
     </w:p>
     <w:p>
       <w:pPr>
         <w:pStyle w:val="ListParagraph"/>
+        <w:keepNext w:val="0"/>
         <w:numPr>
           <w:ilvl w:val="0"/>
           <w:numId w:val="27"/>
         </w:numPr>
       </w:pPr>
       <w:r>
-        <w:t>Harrod, R. F. (1939). An essay in dynamic theory. The Economic Journal, 49(193), 14–33. https://doi.org/10.2307/2225181</w:t>
+        <w:t>Hausmann, R., Hidalgo, C. A., Bustos, S., Coscia, M., Simoes, A., &amp; Yildirim, M. A. (2014). The atlas of economic complexity: Mapping paths to prosperity. MIT Press.</w:t>
       </w:r>
     </w:p>
     <w:p>
       <w:pPr>
         <w:pStyle w:val="ListParagraph"/>
+        <w:keepNext w:val="0"/>
         <w:numPr>
           <w:ilvl w:val="0"/>
           <w:numId w:val="27"/>
         </w:numPr>
-      </w:pPr>
-      <w:r>
-        <w:t>Hausmann, R., Hidalgo, C. A., Bustos, S., Coscia, M., Simoes, A., &amp; Yildirim, M. A. (2014). The atlas of economic complexity: Mapping paths to prosperity. MIT Press.</w:t>
+        <w:ind w:left="714" w:hanging="357"/>
+      </w:pPr>
+      <w:r>
+        <w:t>Hidalgo, C. A. (2023). The policy implications of economic complexity. Research Policy, 52(9), 104825. https://doi.org/10.1016/j.respol.2023.104825</w:t>
       </w:r>
     </w:p>
     <w:p>
       <w:pPr>
         <w:pStyle w:val="ListParagraph"/>
+        <w:keepNext w:val="0"/>
         <w:numPr>
           <w:ilvl w:val="0"/>
           <w:numId w:val="27"/>
         </w:numPr>
-      </w:pPr>
-      <w:r>
-        <w:t>Hidalgo, C. A. (2023). The policy implications of economic complexity. Research Policy, 52(9), 104825. https://doi.org/10.1016/j.respol.2023.104825</w:t>
+        <w:ind w:left="714" w:hanging="357"/>
+      </w:pPr>
+      <w:r>
+        <w:t>Hidalgo, C. A., &amp; Hausmann, R. (2009). The building blocks of economic complexity. Proceedings of the National Academy of Sciences, 106(26), 10570–10575. https://doi.org/10.1073/pnas.0900943106</w:t>
       </w:r>
     </w:p>
     <w:p>
       <w:pPr>
         <w:pStyle w:val="ListParagraph"/>
+        <w:keepNext w:val="0"/>
         <w:numPr>
           <w:ilvl w:val="0"/>
           <w:numId w:val="27"/>
         </w:numPr>
-      </w:pPr>
-      <w:r>
-        <w:t>Hidalgo, C. A., &amp; Hausmann, R. (2009). The building blocks of economic complexity. Proceedings of the National Academy of Sciences, 106(26), 10570–10575. https://doi.org/10.1073/pnas.0900943106</w:t>
+        <w:ind w:left="714" w:hanging="357"/>
+      </w:pPr>
+      <w:r>
+        <w:t>Hidalgo, C. A., Klinger, B., Barabási, A.-L., &amp; Hausmann, R. (2007). The product space conditions the development of nations. Science, 317(5837), 482–487. https://doi.org/10.1126/science.1144581</w:t>
       </w:r>
     </w:p>
     <w:p>
       <w:pPr>
         <w:pStyle w:val="ListParagraph"/>
+        <w:keepNext w:val="0"/>
         <w:numPr>
           <w:ilvl w:val="0"/>
           <w:numId w:val="27"/>
         </w:numPr>
-      </w:pPr>
-      <w:r>
-        <w:t>Hidalgo, C. A., Klinger, B., Barabási, A.-L., &amp; Hausmann, R. (2007). The product space conditions the development of nations. Science, 317(5837), 482–487. https://doi.org/10.1126/science.1144581</w:t>
+        <w:ind w:left="714" w:hanging="357"/>
+      </w:pPr>
+      <w:r>
+        <w:t>Hughes, W. (2026). Indonesia's 2026 policy tightening has repriced the nickel cost map. Crux Investor, May 16, 2026. https://www.cruxinvestor.com/posts/indonesias-2026-policy-tightening-has-repriced-the-nickel-cost-map</w:t>
       </w:r>
     </w:p>
     <w:p>
       <w:pPr>
         <w:pStyle w:val="ListParagraph"/>
+        <w:keepNext w:val="0"/>
         <w:numPr>
           <w:ilvl w:val="0"/>
           <w:numId w:val="27"/>
         </w:numPr>
-      </w:pPr>
-      <w:r>
+        <w:ind w:left="714" w:hanging="357"/>
+      </w:pPr>
+      <w:r>
+        <w:lastRenderedPageBreak/>
         <w:t>Juhász, R., &amp; Lane, N. (2024). The political economy of industrial policy. Journal of Economic Perspectives, 38(4), 27–50. https://doi.org/10.1257/jep.38.4.27</w:t>
       </w:r>
     </w:p>
     <w:p>
       <w:pPr>
         <w:pStyle w:val="ListParagraph"/>
+        <w:keepNext w:val="0"/>
         <w:numPr>
           <w:ilvl w:val="0"/>
           <w:numId w:val="27"/>
         </w:numPr>
+        <w:ind w:left="714" w:hanging="357"/>
       </w:pPr>
       <w:r>
         <w:t>Lee, K., &amp; Malerba, F. (2017). Catch-up cycles and changes in industrial leadership: Windows of opportunity and responses of firms and countries in the evolution of sectoral systems. Research Policy, 46(2), 338–351. https://doi.org/10.1016/j.respol.2016.09.006</w:t>
@@ -15283,98 +15349,110 @@
     <w:p>
       <w:pPr>
         <w:pStyle w:val="ListParagraph"/>
+        <w:keepNext w:val="0"/>
         <w:numPr>
           <w:ilvl w:val="0"/>
           <w:numId w:val="27"/>
         </w:numPr>
-      </w:pPr>
-      <w:r>
-        <w:t>Lowy Institute. (2025). The future of Indonesia’s green industrial policy. Lowy Institute Policy Brief, March 3, 2025.</w:t>
+        <w:ind w:left="714" w:hanging="357"/>
+      </w:pPr>
+      <w:r>
+        <w:t>Manini. (2025). Indonesia’s nickel strategy: Downstreaming and development. Observer Research Foundation Expert Speak, October 15, 2025. https://www.orfonline.org/expert-speak/indonesia-s-nickel-strategy-downstreaming-and-development</w:t>
       </w:r>
     </w:p>
     <w:p>
       <w:pPr>
         <w:pStyle w:val="ListParagraph"/>
+        <w:keepNext w:val="0"/>
         <w:numPr>
           <w:ilvl w:val="0"/>
           <w:numId w:val="27"/>
         </w:numPr>
-      </w:pPr>
-      <w:r>
-        <w:t>Manini. (2025). Indonesia’s nickel strategy: Downstreaming and development. Observer Research Foundation Expert Speak, October 15, 2025. https://www.orfonline.org/expert-speak/indonesia-s-nickel-strategy-downstreaming-and-development</w:t>
+        <w:ind w:left="714" w:hanging="357"/>
+      </w:pPr>
+      <w:r>
+        <w:t>McKinsey &amp; Company. (2024). Diversifying global supply chains: Opportunities in Southeast Asia. McKinsey Insights, September 5, 2024. https://www.mckinsey.com/industries/logistics/our-insights/diversifying-global-supply-chains-opportunities-in-southeast-asia</w:t>
       </w:r>
     </w:p>
     <w:p>
       <w:pPr>
         <w:pStyle w:val="ListParagraph"/>
+        <w:keepNext w:val="0"/>
         <w:numPr>
           <w:ilvl w:val="0"/>
           <w:numId w:val="27"/>
         </w:numPr>
-      </w:pPr>
-      <w:r>
-        <w:t>McKinsey &amp; Company. (2024). Diversifying global supply chains: Opportunities in Southeast Asia. McKinsey Insights, September 4, 2024.</w:t>
+        <w:ind w:left="714" w:hanging="357"/>
+      </w:pPr>
+      <w:r>
+        <w:t>McKinsey &amp; Company. (2025). The enterprising archipelago: Propelling Indonesia’s productivity. McKinsey Global Institute Report, April 2025. https://www.mckinsey.com/mgi/our-research/the-enterprising-archipelago-propelling-indonesias-productivity</w:t>
       </w:r>
     </w:p>
     <w:p>
       <w:pPr>
         <w:pStyle w:val="ListParagraph"/>
+        <w:keepNext w:val="0"/>
         <w:numPr>
           <w:ilvl w:val="0"/>
           <w:numId w:val="27"/>
         </w:numPr>
-      </w:pPr>
-      <w:r>
-        <w:t>McKinsey &amp; Company. (2025). The enterprising archipelago: Propelling Indonesia’s productivity. McKinsey Global Institute Report, April 29, 2025.</w:t>
+        <w:ind w:left="714" w:hanging="357"/>
+      </w:pPr>
+      <w:r>
+        <w:t>Oxford Business Group. (2024). Indonesia’s human capital initiatives: Jobs, education and skills. In The Report: Indonesia 2024. Oxford Business Group, October 2024. https://oxfordbusinessgroup.com/reports/indonesia/2024-report/economy/strong-foundation-human-capital-initiatives-take-centre-stage-as-development-plans-focus-on-employment-education-and-upskilling-analysis/</w:t>
       </w:r>
     </w:p>
     <w:p>
       <w:pPr>
         <w:pStyle w:val="ListParagraph"/>
+        <w:keepNext w:val="0"/>
         <w:numPr>
           <w:ilvl w:val="0"/>
           <w:numId w:val="27"/>
         </w:numPr>
-      </w:pPr>
-      <w:r>
-        <w:t>Oxford Business Group. (2024). Indonesia’s human capital initiatives: Jobs, education and skills. Oxford Business Group Report, October 14, 2024.</w:t>
+        <w:ind w:left="714" w:hanging="357"/>
+      </w:pPr>
+      <w:r>
+        <w:t>S&amp;P Global. (2025). Indonesia navigates nickel market with output cuts, policy shifts. S&amp;P Global Commodity Insights, December 29, 2025. https://www.spglobal.com/energy/en/news-research/latest-news/metals/122925-indonesia-navigates-nickel-market-with-output-cuts-policy-shifts</w:t>
       </w:r>
     </w:p>
     <w:p>
       <w:pPr>
         <w:pStyle w:val="ListParagraph"/>
+        <w:keepNext w:val="0"/>
         <w:numPr>
           <w:ilvl w:val="0"/>
           <w:numId w:val="27"/>
         </w:numPr>
-      </w:pPr>
-      <w:r>
-        <w:t>Public Citizen. (2025). The deadly cost of nickel mining in Indonesia. Public Citizen’s Global Trade Watch, December 9, 2025. https://gtwaction.org/the-deadly-cost-of-nickel-mining-in-indonesia/</w:t>
+        <w:ind w:left="714" w:hanging="357"/>
+      </w:pPr>
+      <w:r>
+        <w:t>Sciarra, C., Chiarotti, G., Laio, F., &amp; Ridolfi, L. (2020). Reconciling contrasting views on economic complexity. Nature Communications, 11(1), 3352. https://doi.org/10.1038/s41467-020-16992-1</w:t>
       </w:r>
     </w:p>
     <w:p>
       <w:pPr>
         <w:pStyle w:val="ListParagraph"/>
+        <w:keepNext w:val="0"/>
         <w:numPr>
           <w:ilvl w:val="0"/>
           <w:numId w:val="27"/>
         </w:numPr>
-      </w:pPr>
-      <w:r>
-        <w:t xml:space="preserve">S&amp;P Global. (2025). Indonesia navigates nickel market with output cuts, policy shifts. S&amp;P Global Commodity Insights, December 29, 2025. </w:t>
-      </w:r>
-      <w:r>
-        <w:lastRenderedPageBreak/>
-        <w:t>https://www.spglobal.com/energy/en/news-research/latest-news/metals/122925-indonesia-navigates-nickel-market-with-output-cuts-policy-shifts</w:t>
+        <w:ind w:left="714" w:hanging="357"/>
+      </w:pPr>
+      <w:r>
+        <w:t>Solow, R. M. (1956). A contribution to the theory of economic growth. The Quarterly Journal of Economics, 70(1), 65–94. https://doi.org/10.2307/1884513</w:t>
       </w:r>
     </w:p>
     <w:p>
       <w:pPr>
         <w:pStyle w:val="ListParagraph"/>
+        <w:keepNext w:val="0"/>
         <w:numPr>
           <w:ilvl w:val="0"/>
           <w:numId w:val="27"/>
         </w:numPr>
+        <w:ind w:left="714" w:hanging="357"/>
         <w:rPr>
           <w:color w:val="000000"/>
         </w:rPr>
@@ -15383,16 +15461,18 @@
         <w:rPr>
           <w:color w:val="000000"/>
         </w:rPr>
-        <w:t>Sciarra, C., Chiarotti, G., Laio, F., &amp; Ridolfi, L. (2020). Reconciling contrasting views on economic complexity. Nature Communications, 11(1), 3352. https://doi.org/10.1038/s41467-020-16992-1</w:t>
+        <w:t>Stojkoski, V., &amp; Hidalgo, C. A. (2025). Optimal diversification in the presence of constraints: An economic complexity approach. Journal of Economic Geography. Advance online publication. https://doi.org/10.1093/jeg/lbae042</w:t>
       </w:r>
     </w:p>
     <w:p>
       <w:pPr>
         <w:pStyle w:val="ListParagraph"/>
+        <w:keepNext w:val="0"/>
         <w:numPr>
           <w:ilvl w:val="0"/>
           <w:numId w:val="27"/>
         </w:numPr>
+        <w:ind w:left="714" w:hanging="357"/>
         <w:rPr>
           <w:color w:val="000000"/>
         </w:rPr>
@@ -15401,16 +15481,18 @@
         <w:rPr>
           <w:color w:val="000000"/>
         </w:rPr>
-        <w:t>Solow, R. M. (1956). A contribution to the theory of economic growth. The Quarterly Journal of Economics, 70(1), 65–94. https://doi.org/10.2307/1884513</w:t>
+        <w:t>Stojkoski, V., &amp; Hidalgo, C. A. (2025). Optimizing Economic Complexity. Working Papers hal-04990629, HAL.</w:t>
       </w:r>
     </w:p>
     <w:p>
       <w:pPr>
         <w:pStyle w:val="ListParagraph"/>
+        <w:keepNext w:val="0"/>
         <w:numPr>
           <w:ilvl w:val="0"/>
           <w:numId w:val="27"/>
         </w:numPr>
+        <w:ind w:left="714" w:hanging="357"/>
         <w:rPr>
           <w:color w:val="000000"/>
         </w:rPr>
@@ -15419,16 +15501,18 @@
         <w:rPr>
           <w:color w:val="000000"/>
         </w:rPr>
-        <w:t>Stojkoski, V., &amp; Hidalgo, C. A. (2025). Optimal diversification in the presence of constraints: An economic complexity approach. Journal of Economic Geography. Advance online publication. https://doi.org/10.1093/jeg/lbae042</w:t>
+        <w:t>Stojkoski, V., Utkovski, Z., Jolakoski, P., Tevdovski, D., &amp; Kocarev, L. (2023). The multidimensional nature of economic complexity. Research Policy, 52(8), 104825. https://doi.org/10.1016/j.respol.2023.104825</w:t>
       </w:r>
     </w:p>
     <w:p>
       <w:pPr>
         <w:pStyle w:val="ListParagraph"/>
+        <w:keepNext w:val="0"/>
         <w:numPr>
           <w:ilvl w:val="0"/>
           <w:numId w:val="27"/>
         </w:numPr>
+        <w:ind w:left="714" w:hanging="357"/>
         <w:rPr>
           <w:color w:val="000000"/>
         </w:rPr>
@@ -15437,16 +15521,18 @@
         <w:rPr>
           <w:color w:val="000000"/>
         </w:rPr>
-        <w:t>Stojkoski, V., &amp; Hidalgo, C. A. (2025). Optimizing Economic Complexity. Working Papers hal-04990629, HAL.</w:t>
+        <w:t>Tacchella, A., Cristelli, M., Caldarelli, G., Gabrielli, A., &amp; Pietronero, L. (2012). A new metrics for countries’ fitness and products’ complexity. Scientific Reports, 2(1), 723. https://doi.org/10.1038/srep00723</w:t>
       </w:r>
     </w:p>
     <w:p>
       <w:pPr>
         <w:pStyle w:val="ListParagraph"/>
+        <w:keepNext w:val="0"/>
         <w:numPr>
           <w:ilvl w:val="0"/>
           <w:numId w:val="27"/>
         </w:numPr>
+        <w:ind w:left="714" w:hanging="357"/>
         <w:rPr>
           <w:color w:val="000000"/>
         </w:rPr>
@@ -15455,16 +15541,18 @@
         <w:rPr>
           <w:color w:val="000000"/>
         </w:rPr>
-        <w:t>Stojkoski, V., Utkovski, Z., Jolakoski, P., Tevdovski, D., &amp; Kocarev, L. (2023). The multidimensional nature of economic complexity. Research Policy, 52(8), 104825. https://doi.org/10.1016/j.respol.2023.104825</w:t>
+        <w:t>The Growth Lab at Harvard University, 2026, "International Trade Data (HS12)", https://doi.org/10.7910/DVN/YAVJDF, Harvard Dataverse</w:t>
       </w:r>
     </w:p>
     <w:p>
       <w:pPr>
         <w:pStyle w:val="ListParagraph"/>
+        <w:keepNext w:val="0"/>
         <w:numPr>
           <w:ilvl w:val="0"/>
           <w:numId w:val="27"/>
         </w:numPr>
+        <w:ind w:left="714" w:hanging="357"/>
         <w:rPr>
           <w:color w:val="000000"/>
         </w:rPr>
@@ -15473,16 +15561,25 @@
         <w:rPr>
           <w:color w:val="000000"/>
         </w:rPr>
-        <w:t>Tacchella, A., Cristelli, M., Caldarelli, G., Gabrielli, A., &amp; Pietronero, L. (2012). A new metrics for countries’ fitness and products’ complexity. Scientific Reports, 2(1), 723. https://doi.org/10.1038/srep00723</w:t>
+        <w:t xml:space="preserve">Utamawati, H., &amp; Yusuf, A. (2026). How Indonesia's ban on raw nickel exports provides lessons for fiscal and economic policy in the low-carbon transition. CETEx Policy Insight, March 2026. London: Centre for Economic Transition Expertise, London School of </w:t>
+      </w:r>
+      <w:r>
+        <w:rPr>
+          <w:color w:val="000000"/>
+        </w:rPr>
+        <w:lastRenderedPageBreak/>
+        <w:t>Economics and Political Science. https://cetex.org/wp-content/uploads/2026/03/Indonesia-Ban-on-Exports-of-Raw-Nickel.pdf</w:t>
       </w:r>
     </w:p>
     <w:p>
       <w:pPr>
         <w:pStyle w:val="ListParagraph"/>
+        <w:keepNext w:val="0"/>
         <w:numPr>
           <w:ilvl w:val="0"/>
           <w:numId w:val="27"/>
         </w:numPr>
+        <w:ind w:left="714" w:hanging="357"/>
         <w:rPr>
           <w:color w:val="000000"/>
         </w:rPr>
@@ -15491,16 +15588,18 @@
         <w:rPr>
           <w:color w:val="000000"/>
         </w:rPr>
-        <w:t>The Growth Lab at Harvard University, 2026, "International Trade Data (HS12)", https://doi.org/10.7910/DVN/YAVJDF, Harvard Dataverse</w:t>
+        <w:t>Uzcategui, D. (2025). Indonesia’s nickel gamble pays off. Breakbulk Magazine, November 13, 2025. https://breakbulk.com/articles/indonesias-nickel-gamble-pays-off</w:t>
       </w:r>
     </w:p>
     <w:p>
       <w:pPr>
         <w:pStyle w:val="ListParagraph"/>
+        <w:keepNext w:val="0"/>
         <w:numPr>
           <w:ilvl w:val="0"/>
           <w:numId w:val="27"/>
         </w:numPr>
+        <w:ind w:left="714" w:hanging="357"/>
         <w:rPr>
           <w:color w:val="000000"/>
         </w:rPr>
@@ -15509,16 +15608,18 @@
         <w:rPr>
           <w:color w:val="000000"/>
         </w:rPr>
-        <w:t>Uzcategui, D. (2025). Indonesia’s nickel gamble pays off. Breakbulk Magazine, November 13, 2025. https://breakbulk.com/articles/indonesias-nickel-gamble-pays-off</w:t>
+        <w:t>Walker, R., &amp; Palaon, H. (2025). The future of Indonesia's green industrial policy. Lowy Institute Analysis, March 5, 2025. https://www.lowyinstitute.org/publications/future-indonesia-s-green-industrial-policy</w:t>
       </w:r>
     </w:p>
     <w:p>
       <w:pPr>
         <w:pStyle w:val="ListParagraph"/>
+        <w:keepNext w:val="0"/>
         <w:numPr>
           <w:ilvl w:val="0"/>
           <w:numId w:val="27"/>
         </w:numPr>
+        <w:ind w:left="714" w:hanging="357"/>
         <w:rPr>
           <w:color w:val="000000"/>
         </w:rPr>
@@ -15527,16 +15628,30 @@
         <w:rPr>
           <w:color w:val="000000"/>
         </w:rPr>
-        <w:t>Wardana, H. (2026). Indonesia’s nickel export ban: An industrial policy case study. IISD Webinar: Industrial Policy and Trade, 2026. https://www.iisd.org/system/files/2026-03/harry_wardana-industrial_policy-webinar-03.13.pdf</w:t>
+        <w:t>Wardana, H. (2026). Indonesia’s nickel export ban: An industrial policy case study. IISD Webinar: Industrial Policy and Trade</w:t>
+      </w:r>
+      <w:r>
+        <w:rPr>
+          <w:color w:val="000000"/>
+        </w:rPr>
+        <w:t xml:space="preserve"> — Key Developments, March 13, 2026. Institute for International Trade, Adelaide University</w:t>
+      </w:r>
+      <w:r>
+        <w:rPr>
+          <w:color w:val="000000"/>
+        </w:rPr>
+        <w:t>. https://www.iisd.org/system/files/2026-03/harry_wardana-industrial_policy-webinar-03.13.pdf</w:t>
       </w:r>
     </w:p>
     <w:p>
       <w:pPr>
         <w:pStyle w:val="ListParagraph"/>
+        <w:keepNext w:val="0"/>
         <w:numPr>
           <w:ilvl w:val="0"/>
           <w:numId w:val="27"/>
         </w:numPr>
+        <w:ind w:left="714" w:hanging="357"/>
         <w:rPr>
           <w:color w:val="000000"/>
         </w:rPr>
@@ -15551,10 +15666,12 @@
     <w:p>
       <w:pPr>
         <w:pStyle w:val="ListParagraph"/>
+        <w:keepNext w:val="0"/>
         <w:numPr>
           <w:ilvl w:val="0"/>
           <w:numId w:val="27"/>
         </w:numPr>
+        <w:ind w:left="714" w:hanging="357"/>
         <w:rPr>
           <w:color w:val="000000"/>
         </w:rPr>
@@ -15569,10 +15686,12 @@
     <w:p>
       <w:pPr>
         <w:pStyle w:val="ListParagraph"/>
+        <w:keepNext w:val="0"/>
         <w:numPr>
           <w:ilvl w:val="0"/>
           <w:numId w:val="27"/>
         </w:numPr>
+        <w:ind w:left="714" w:hanging="357"/>
         <w:rPr>
           <w:color w:val="000000"/>
         </w:rPr>
@@ -15745,7 +15864,7 @@
                     <pic:cNvPicPr/>
                   </pic:nvPicPr>
                   <pic:blipFill>
-                    <a:blip r:embed="rId18"/>
+                    <a:blip r:embed="rId19"/>
                     <a:stretch>
                       <a:fillRect/>
                     </a:stretch>
@@ -15795,7 +15914,7 @@
                     </pic:cNvPicPr>
                   </pic:nvPicPr>
                   <pic:blipFill>
-                    <a:blip r:embed="rId19">
+                    <a:blip r:embed="rId20">
                       <a:extLst>
                         <a:ext uri="{28A0092B-C50C-407E-A947-70E740481C1C}">
                           <a14:useLocalDpi xmlns:a14="http://schemas.microsoft.com/office/drawing/2010/main" val="0"/>
@@ -15851,7 +15970,7 @@
       <w:r>
         <w:t xml:space="preserve">) from </w:t>
       </w:r>
-      <w:hyperlink r:id="rId20" w:history="1">
+      <w:hyperlink r:id="rId21" w:history="1">
         <w:r>
           <w:rPr>
             <w:rStyle w:val="Hyperlink"/>
@@ -15861,12 +15980,12 @@
       </w:hyperlink>
     </w:p>
     <w:sectPr>
-      <w:headerReference w:type="even" r:id="rId21"/>
-      <w:headerReference w:type="default" r:id="rId22"/>
-      <w:footerReference w:type="even" r:id="rId23"/>
-      <w:footerReference w:type="default" r:id="rId24"/>
-      <w:headerReference w:type="first" r:id="rId25"/>
-      <w:footerReference w:type="first" r:id="rId26"/>
+      <w:headerReference w:type="even" r:id="rId22"/>
+      <w:headerReference w:type="default" r:id="rId23"/>
+      <w:footerReference w:type="even" r:id="rId24"/>
+      <w:footerReference w:type="default" r:id="rId25"/>
+      <w:headerReference w:type="first" r:id="rId26"/>
+      <w:footerReference w:type="first" r:id="rId27"/>
       <w:pgSz w:w="11906" w:h="16838"/>
       <w:pgMar w:top="1440" w:right="1440" w:bottom="1440" w:left="1440" w:header="720" w:footer="720" w:gutter="0"/>
       <w:cols w:space="720"/>

</xml_diff>